<commit_message>
Landing y thank you: la clase pasa al sábado 24 a las 18 hs, +3.500 suscriptores y menos de 5% de churn
Co-Authored-By: Claude Opus 5.5 <noreply@anthropic.com>
Claude-Session: https://claude.ai/code/session_011cHZCWCbXV7WqvXcQ2jLM2
</commit_message>
<xml_diff>
--- a/agentes/mi-negocio/entregables/repesca-24-10-post-clase-mails.docx
+++ b/agentes/mi-negocio/entregables/repesca-24-10-post-clase-mails.docx
@@ -183,6 +183,22 @@
         </w:numPr>
         <w:pStyle w:val="Compact"/>
       </w:pPr>
+      <w:r>
+        <w:rPr>
+          <w:bCs/>
+          <w:b/>
+        </w:rPr>
+        <w:t xml:space="preserve">Antes del domingo a las 9:</w:t>
+      </w:r>
+      <w:r>
+        <w:t xml:space="preserve"> </w:t>
+      </w:r>
+      <w:r>
+        <w:t xml:space="preserve">cargar en</w:t>
+      </w:r>
+      <w:r>
+        <w:t xml:space="preserve"> </w:t>
+      </w:r>
       <w:hyperlink r:id="rId20">
         <w:r>
           <w:rPr>
@@ -195,7 +211,7 @@
         <w:t xml:space="preserve"> </w:t>
       </w:r>
       <w:r>
-        <w:t xml:space="preserve">y hasta cuándo está la repetición.</w:t>
+        <w:t xml:space="preserve">el video de la clase del sábado (hoy tiene el del lunes 19).</w:t>
       </w:r>
     </w:p>
     <w:p>

</xml_diff>

<commit_message>
Landing a +250M y post-clase con el link de /aplication
Co-Authored-By: Claude Opus 5.5 <noreply@anthropic.com>
Claude-Session: https://claude.ai/code/session_011cHZCWCbXV7WqvXcQ2jLM2
</commit_message>
<xml_diff>
--- a/agentes/mi-negocio/entregables/repesca-24-10-post-clase-mails.docx
+++ b/agentes/mi-negocio/entregables/repesca-24-10-post-clase-mails.docx
@@ -2,7 +2,7 @@
 <file path=word/document.xml><?xml version="1.0" encoding="utf-8"?>
 <w:document xmlns:w="http://schemas.openxmlformats.org/wordprocessingml/2006/main" xmlns:m="http://schemas.openxmlformats.org/officeDocument/2006/math" xmlns:r="http://schemas.openxmlformats.org/officeDocument/2006/relationships" xmlns:o="urn:schemas-microsoft-com:office:office" xmlns:v="urn:schemas-microsoft-com:vml" xmlns:w10="urn:schemas-microsoft-com:office:word" xmlns:a="http://schemas.openxmlformats.org/drawingml/2006/main" xmlns:pic="http://schemas.openxmlformats.org/drawingml/2006/picture" xmlns:wp="http://schemas.openxmlformats.org/drawingml/2006/wordprocessingDrawing">
   <w:body>
-    <w:bookmarkStart w:id="27" w:name="post-clase--mails--domingo-2510"/>
+    <w:bookmarkStart w:id="28" w:name="post-clase--mails--domingo-2510"/>
     <w:p>
       <w:pPr>
         <w:pStyle w:val="Heading1"/>
@@ -28,7 +28,7 @@
         <w:t xml:space="preserve">), pero cada mail se sostiene solo.</w:t>
       </w:r>
     </w:p>
-    <w:bookmarkStart w:id="21" w:name="reglas"/>
+    <w:bookmarkStart w:id="22" w:name="reglas"/>
     <w:p>
       <w:pPr>
         <w:pStyle w:val="Heading2"/>
@@ -94,16 +94,18 @@
         <w:t xml:space="preserve"> </w:t>
       </w:r>
       <w:r>
-        <w:t xml:space="preserve">(</w:t>
-      </w:r>
-      <w:r>
-        <w:rPr>
-          <w:rStyle w:val="VerbatimChar"/>
-        </w:rPr>
-        <w:t xml:space="preserve">[LINK AGENDA]</w:t>
-      </w:r>
-      <w:r>
-        <w:t xml:space="preserve">). Sin precio y sin link de pago.</w:t>
+        <w:t xml:space="preserve">con el formulario de aplicación (</w:t>
+      </w:r>
+      <w:hyperlink r:id="rId20">
+        <w:r>
+          <w:rPr>
+            <w:rStyle w:val="Hyperlink"/>
+          </w:rPr>
+          <w:t xml:space="preserve">https://applygenesis.com/aplication?utm_source=email&amp;utm_medium=post-clase&amp;utm_campaign=genesis-24-10</w:t>
+        </w:r>
+      </w:hyperlink>
+      <w:r>
+        <w:t xml:space="preserve">): el lead aplica y agenda. Sin precio y sin link de pago.</w:t>
       </w:r>
     </w:p>
     <w:p>
@@ -172,7 +174,7 @@
           <w:bCs/>
           <w:b/>
         </w:rPr>
-        <w:t xml:space="preserve">Datos a completar antes de mandar:</w:t>
+        <w:t xml:space="preserve">Antes de mandar:</w:t>
       </w:r>
     </w:p>
     <w:p>
@@ -199,7 +201,7 @@
       <w:r>
         <w:t xml:space="preserve"> </w:t>
       </w:r>
-      <w:hyperlink r:id="rId20">
+      <w:hyperlink r:id="rId21">
         <w:r>
           <w:rPr>
             <w:rStyle w:val="Hyperlink"/>
@@ -214,26 +216,8 @@
         <w:t xml:space="preserve">el video de la clase del sábado (hoy tiene el del lunes 19).</w:t>
       </w:r>
     </w:p>
-    <w:p>
-      <w:pPr>
-        <w:numPr>
-          <w:ilvl w:val="0"/>
-          <w:numId w:val="1002"/>
-        </w:numPr>
-        <w:pStyle w:val="Compact"/>
-      </w:pPr>
-      <w:r>
-        <w:rPr>
-          <w:rStyle w:val="VerbatimChar"/>
-        </w:rPr>
-        <w:t xml:space="preserve">[LINK AGENDA]</w:t>
-      </w:r>
-      <w:r>
-        <w:t xml:space="preserve">.</w:t>
-      </w:r>
-    </w:p>
-    <w:bookmarkEnd w:id="21"/>
-    <w:bookmarkStart w:id="22" w:name="resumen"/>
+    <w:bookmarkEnd w:id="22"/>
+    <w:bookmarkStart w:id="23" w:name="resumen"/>
     <w:p>
       <w:pPr>
         <w:pStyle w:val="Heading2"/>
@@ -516,8 +500,8 @@
         </w:pict>
       </w:r>
     </w:p>
-    <w:bookmarkEnd w:id="22"/>
-    <w:bookmarkStart w:id="23" w:name="p-1--domingo-25--0900"/>
+    <w:bookmarkEnd w:id="23"/>
+    <w:bookmarkStart w:id="24" w:name="p-1--domingo-25--0900"/>
     <w:p>
       <w:pPr>
         <w:pStyle w:val="Heading2"/>
@@ -590,7 +574,7 @@
       <w:r>
         <w:t xml:space="preserve"> </w:t>
       </w:r>
-      <w:hyperlink r:id="rId20">
+      <w:hyperlink r:id="rId21">
         <w:r>
           <w:rPr>
             <w:rStyle w:val="Hyperlink"/>
@@ -646,12 +630,14 @@
       <w:r>
         <w:t xml:space="preserve"> </w:t>
       </w:r>
-      <w:r>
-        <w:rPr>
-          <w:rStyle w:val="VerbatimChar"/>
-        </w:rPr>
-        <w:t xml:space="preserve">[LINK AGENDA]</w:t>
-      </w:r>
+      <w:hyperlink r:id="rId20">
+        <w:r>
+          <w:rPr>
+            <w:rStyle w:val="Hyperlink"/>
+          </w:rPr>
+          <w:t xml:space="preserve">https://applygenesis.com/aplication?utm_source=email&amp;utm_medium=post-clase&amp;utm_campaign=genesis-24-10</w:t>
+        </w:r>
+      </w:hyperlink>
     </w:p>
     <w:p>
       <w:r>
@@ -660,8 +646,8 @@
         </w:pict>
       </w:r>
     </w:p>
-    <w:bookmarkEnd w:id="23"/>
-    <w:bookmarkStart w:id="24" w:name="p-2--domingo-25--1400"/>
+    <w:bookmarkEnd w:id="24"/>
+    <w:bookmarkStart w:id="25" w:name="p-2--domingo-25--1400"/>
     <w:p>
       <w:pPr>
         <w:pStyle w:val="Heading2"/>
@@ -774,12 +760,14 @@
       <w:r>
         <w:t xml:space="preserve"> </w:t>
       </w:r>
-      <w:r>
-        <w:rPr>
-          <w:rStyle w:val="VerbatimChar"/>
-        </w:rPr>
-        <w:t xml:space="preserve">[LINK AGENDA]</w:t>
-      </w:r>
+      <w:hyperlink r:id="rId20">
+        <w:r>
+          <w:rPr>
+            <w:rStyle w:val="Hyperlink"/>
+          </w:rPr>
+          <w:t xml:space="preserve">https://applygenesis.com/aplication?utm_source=email&amp;utm_medium=post-clase&amp;utm_campaign=genesis-24-10</w:t>
+        </w:r>
+      </w:hyperlink>
     </w:p>
     <w:p>
       <w:pPr>
@@ -804,8 +792,8 @@
         </w:pict>
       </w:r>
     </w:p>
-    <w:bookmarkEnd w:id="24"/>
-    <w:bookmarkStart w:id="25" w:name="p-3--domingo-25--2000"/>
+    <w:bookmarkEnd w:id="25"/>
+    <w:bookmarkStart w:id="26" w:name="p-3--domingo-25--2000"/>
     <w:p>
       <w:pPr>
         <w:pStyle w:val="Heading2"/>
@@ -918,12 +906,14 @@
       <w:r>
         <w:t xml:space="preserve"> </w:t>
       </w:r>
-      <w:r>
-        <w:rPr>
-          <w:rStyle w:val="VerbatimChar"/>
-        </w:rPr>
-        <w:t xml:space="preserve">[LINK AGENDA]</w:t>
-      </w:r>
+      <w:hyperlink r:id="rId20">
+        <w:r>
+          <w:rPr>
+            <w:rStyle w:val="Hyperlink"/>
+          </w:rPr>
+          <w:t xml:space="preserve">https://applygenesis.com/aplication?utm_source=email&amp;utm_medium=post-clase&amp;utm_campaign=genesis-24-10</w:t>
+        </w:r>
+      </w:hyperlink>
     </w:p>
     <w:p>
       <w:pPr>
@@ -948,8 +938,8 @@
         </w:pict>
       </w:r>
     </w:p>
-    <w:bookmarkEnd w:id="25"/>
-    <w:bookmarkStart w:id="26" w:name="p-4--domingo-25--2230"/>
+    <w:bookmarkEnd w:id="26"/>
+    <w:bookmarkStart w:id="27" w:name="p-4--domingo-25--2230"/>
     <w:p>
       <w:pPr>
         <w:pStyle w:val="Heading2"/>
@@ -1030,12 +1020,14 @@
       <w:r>
         <w:t xml:space="preserve"> </w:t>
       </w:r>
-      <w:r>
-        <w:rPr>
-          <w:rStyle w:val="VerbatimChar"/>
-        </w:rPr>
-        <w:t xml:space="preserve">[LINK AGENDA]</w:t>
-      </w:r>
+      <w:hyperlink r:id="rId20">
+        <w:r>
+          <w:rPr>
+            <w:rStyle w:val="Hyperlink"/>
+          </w:rPr>
+          <w:t xml:space="preserve">https://applygenesis.com/aplication?utm_source=email&amp;utm_medium=post-clase&amp;utm_campaign=genesis-24-10</w:t>
+        </w:r>
+      </w:hyperlink>
     </w:p>
     <w:p>
       <w:pPr>
@@ -1045,8 +1037,8 @@
         <w:t xml:space="preserve">Manu</w:t>
       </w:r>
     </w:p>
-    <w:bookmarkEnd w:id="26"/>
     <w:bookmarkEnd w:id="27"/>
+    <w:bookmarkEnd w:id="28"/>
     <w:sectPr/>
   </w:body>
 </w:document>

</xml_diff>